<commit_message>
docs: fix inline formatting in the Word guide
Co-Authored-By: Claude Fable 5.1 <noreply@anthropic.com>
</commit_message>
<xml_diff>
--- a/docs/How to Update the Pack 96 Website.docx
+++ b/docs/How to Update the Pack 96 Website.docx
@@ -2603,7 +2603,18 @@
           <w:b/>
           <w:bCs/>
         </w:rPr>
-        <w:t xml:space="preserve">Changing what's in `private.json`</w:t>
+        <w:t xml:space="preserve">Changing what's in </w:t>
+      </w:r>
+      <w:r>
+        <w:rPr>
+          <w:rFonts w:ascii="Consolas" w:cs="Consolas" w:eastAsia="Consolas" w:hAnsi="Consolas"/>
+          <w:b/>
+          <w:bCs/>
+          <w:sz w:val="20"/>
+          <w:szCs w:val="20"/>
+          <w:shd w:fill="EEF1F5" w:val="clear"/>
+        </w:rPr>
+        <w:t xml:space="preserve">private.json</w:t>
       </w:r>
       <w:r>
         <w:rPr>
@@ -4409,22 +4420,16 @@
       <w:r>
         <w:rPr>
           <w:rFonts w:ascii="Calibri" w:cs="Calibri" w:eastAsia="Calibri" w:hAnsi="Calibri"/>
-        </w:rPr>
-        <w:t xml:space="preserve">*</w:t>
-      </w:r>
-      <w:r>
-        <w:rPr>
-          <w:rFonts w:ascii="Calibri" w:cs="Calibri" w:eastAsia="Calibri" w:hAnsi="Calibri"/>
-          <w:i/>
-          <w:iCs/>
-        </w:rPr>
-        <w:t xml:space="preserve">The Drive folder </w:t>
-      </w:r>
-      <w:r>
-        <w:rPr>
-          <w:rFonts w:ascii="Calibri" w:cs="Calibri" w:eastAsia="Calibri" w:hAnsi="Calibri"/>
-        </w:rPr>
-        <w:t xml:space="preserve">Pack 96 Website***, including </w:t>
+          <w:b/>
+          <w:bCs/>
+        </w:rPr>
+        <w:t xml:space="preserve">The Drive folder *Pack 96 Website</w:t>
+      </w:r>
+      <w:r>
+        <w:rPr>
+          <w:rFonts w:ascii="Calibri" w:cs="Calibri" w:eastAsia="Calibri" w:hAnsi="Calibri"/>
+        </w:rPr>
+        <w:t xml:space="preserve">*, including </w:t>
       </w:r>
       <w:r>
         <w:rPr>

</xml_diff>

<commit_message>
docs: guide wording fix, Word rebuild
Co-Authored-By: Claude Fable 5.1 <noreply@anthropic.com>
</commit_message>
<xml_diff>
--- a/docs/How to Update the Pack 96 Website.docx
+++ b/docs/How to Update the Pack 96 Website.docx
@@ -4423,13 +4423,27 @@
           <w:b/>
           <w:bCs/>
         </w:rPr>
-        <w:t xml:space="preserve">The Drive folder *Pack 96 Website</w:t>
-      </w:r>
-      <w:r>
-        <w:rPr>
-          <w:rFonts w:ascii="Calibri" w:cs="Calibri" w:eastAsia="Calibri" w:hAnsi="Calibri"/>
-        </w:rPr>
-        <w:t xml:space="preserve">*, including </w:t>
+        <w:t xml:space="preserve">The Drive folder</w:t>
+      </w:r>
+      <w:r>
+        <w:rPr>
+          <w:rFonts w:ascii="Calibri" w:cs="Calibri" w:eastAsia="Calibri" w:hAnsi="Calibri"/>
+        </w:rPr>
+        <w:t xml:space="preserve"> </w:t>
+      </w:r>
+      <w:r>
+        <w:rPr>
+          <w:rFonts w:ascii="Calibri" w:cs="Calibri" w:eastAsia="Calibri" w:hAnsi="Calibri"/>
+          <w:i/>
+          <w:iCs/>
+        </w:rPr>
+        <w:t xml:space="preserve">Pack 96 Website</w:t>
+      </w:r>
+      <w:r>
+        <w:rPr>
+          <w:rFonts w:ascii="Calibri" w:cs="Calibri" w:eastAsia="Calibri" w:hAnsi="Calibri"/>
+        </w:rPr>
+        <w:t xml:space="preserve">, including </w:t>
       </w:r>
       <w:r>
         <w:rPr>

</xml_diff>